<commit_message>
Moved the sequence diagram to a landscape page and reshot the StarUML frame with the whole diagram
</commit_message>
<xml_diff>
--- a/docs/lab4-rpz.docx
+++ b/docs/lab4-rpz.docx
@@ -790,7 +790,7 @@
     </w:p>
     <w:p>
       <w:pPr>
-        <w:keepNext/>
+        <w:keepNext w:val="0"/>
         <w:pageBreakBefore w:val="0"/>
         <w:widowControl/>
         <w:spacing w:line="360" w:lineRule="auto" w:before="0" w:after="0"/>
@@ -884,7 +884,7 @@
     </w:p>
     <w:p>
       <w:pPr>
-        <w:keepNext/>
+        <w:keepNext w:val="0"/>
         <w:pageBreakBefore w:val="0"/>
         <w:widowControl/>
         <w:spacing w:line="360" w:lineRule="auto" w:before="0" w:after="0"/>
@@ -923,7 +923,7 @@
         </w:rPr>
         <w:drawing>
           <wp:inline xmlns:a="http://schemas.openxmlformats.org/drawingml/2006/main" xmlns:pic="http://schemas.openxmlformats.org/drawingml/2006/picture">
-            <wp:extent cx="5760000" cy="6455309"/>
+            <wp:extent cx="5460807" cy="6119999"/>
             <wp:docPr id="3" name="Picture 3"/>
             <wp:cNvGraphicFramePr>
               <a:graphicFrameLocks noChangeAspect="1"/>
@@ -944,7 +944,7 @@
                   <pic:spPr>
                     <a:xfrm>
                       <a:off x="0" y="0"/>
-                      <a:ext cx="5760000" cy="6455309"/>
+                      <a:ext cx="5460807" cy="6119999"/>
                     </a:xfrm>
                     <a:prstGeom prst="rect"/>
                   </pic:spPr>
@@ -978,7 +978,7 @@
     </w:p>
     <w:p>
       <w:pPr>
-        <w:keepNext/>
+        <w:keepNext w:val="0"/>
         <w:pageBreakBefore w:val="0"/>
         <w:widowControl/>
         <w:spacing w:line="360" w:lineRule="auto" w:before="0" w:after="0"/>
@@ -994,8 +994,20 @@
           <w:sz w:val="28"/>
           <w:u w:val="none"/>
         </w:rPr>
-        <w:t>Диаграмма последовательности (рисунок 3) описывает работу археолога с веб-сервисом: аутентификацию, получение списка княжеств с фильтром по дате основания, добавление княжества с изображением и видео, получение черновика и его публикацию, просмотр ленты с переходом к следующему княжеству и лайк. Линии жизни — страницы React-приложения «Вход археолога», «Плитка княжеств», «Добавление княжества», «Лента княжеств» и домены археологов и княжеств веб-сервиса, сообщения — HTTP-методы из диаграммы классов с ключевыми входными и выходными данными.</w:t>
+        <w:t>Диаграмма последовательности (рисунок 3) описывает работу археолога с веб-сервисом: аутентификацию, получение списка княжеств с фильтром по дате основания, добавление княжества с изображением и видео, получение черновика и его публикацию, просмотр ленты и лайк. Линии жизни — страницы React-приложения и домены веб-сервиса, сообщения — HTTP-методы из диаграммы классов с ключевыми входными и выходными данными.</w:t>
       </w:r>
+    </w:p>
+    <w:p>
+      <w:pPr>
+        <w:sectPr>
+          <w:footerReference w:type="default" r:id="rId9"/>
+          <w:pgSz w:w="11906" w:h="16838"/>
+          <w:pgMar w:top="1134" w:right="850" w:bottom="1134" w:left="1701" w:header="720" w:footer="567" w:gutter="0"/>
+          <w:cols w:space="720"/>
+          <w:titlePg/>
+          <w:docGrid w:linePitch="360"/>
+        </w:sectPr>
+      </w:pPr>
     </w:p>
     <w:p>
       <w:pPr>
@@ -1017,7 +1029,7 @@
         </w:rPr>
         <w:drawing>
           <wp:inline xmlns:a="http://schemas.openxmlformats.org/drawingml/2006/main" xmlns:pic="http://schemas.openxmlformats.org/drawingml/2006/picture">
-            <wp:extent cx="5760000" cy="4103494"/>
+            <wp:extent cx="7680946" cy="5471999"/>
             <wp:docPr id="4" name="Picture 4"/>
             <wp:cNvGraphicFramePr>
               <a:graphicFrameLocks noChangeAspect="1"/>
@@ -1038,7 +1050,7 @@
                   <pic:spPr>
                     <a:xfrm>
                       <a:off x="0" y="0"/>
-                      <a:ext cx="5760000" cy="4103494"/>
+                      <a:ext cx="7680946" cy="5471999"/>
                     </a:xfrm>
                     <a:prstGeom prst="rect"/>
                   </pic:spPr>
@@ -1073,11 +1085,9 @@
     <w:p>
       <w:pPr>
         <w:sectPr>
-          <w:footerReference w:type="default" r:id="rId9"/>
-          <w:pgSz w:w="11906" w:h="16838"/>
+          <w:pgSz w:w="16838" w:h="11906" w:orient="landscape"/>
           <w:pgMar w:top="1134" w:right="850" w:bottom="1134" w:left="1701" w:header="720" w:footer="567" w:gutter="0"/>
           <w:cols w:space="720"/>
-          <w:titlePg/>
           <w:docGrid w:linePitch="360"/>
         </w:sectPr>
       </w:pPr>
@@ -5690,6 +5700,7 @@
     <w:p>
       <w:pPr>
         <w:sectPr>
+          <w:footerReference w:type="first" r:id="rId14"/>
           <w:pgSz w:w="11906" w:h="16838"/>
           <w:pgMar w:top="1134" w:right="850" w:bottom="1134" w:left="1701" w:header="720" w:footer="567" w:gutter="0"/>
           <w:cols w:space="720"/>
@@ -8007,6 +8018,16 @@
 </w:ftr>
 </file>
 
+<file path=word/footer2.xml><?xml version="1.0" encoding="utf-8"?>
+<w:ftr xmlns:m="http://schemas.openxmlformats.org/officeDocument/2006/math" xmlns:mc="http://schemas.openxmlformats.org/markup-compatibility/2006" xmlns:mo="http://schemas.microsoft.com/office/mac/office/2008/main" xmlns:mv="urn:schemas-microsoft-com:mac:vml" xmlns:o="urn:schemas-microsoft-com:office:office" xmlns:r="http://schemas.openxmlformats.org/officeDocument/2006/relationships" xmlns:v="urn:schemas-microsoft-com:vml" xmlns:w10="urn:schemas-microsoft-com:office:word" xmlns:w14="http://schemas.microsoft.com/office/word/2010/wordml" xmlns:w="http://schemas.openxmlformats.org/wordprocessingml/2006/main" xmlns:wne="http://schemas.microsoft.com/office/word/2006/wordml" xmlns:wp14="http://schemas.microsoft.com/office/word/2010/wordprocessingDrawing" xmlns:wp="http://schemas.openxmlformats.org/drawingml/2006/wordprocessingDrawing" xmlns:wpc="http://schemas.microsoft.com/office/word/2010/wordprocessingCanvas" xmlns:wpg="http://schemas.microsoft.com/office/word/2010/wordprocessingGroup" xmlns:wpi="http://schemas.microsoft.com/office/word/2010/wordprocessingInk" xmlns:wps="http://schemas.microsoft.com/office/word/2010/wordprocessingShape" mc:Ignorable="w14 wp14">
+  <w:p>
+    <w:pPr>
+      <w:pStyle w:val="Footer"/>
+    </w:pPr>
+  </w:p>
+</w:ftr>
+</file>
+
 <file path=word/numbering.xml><?xml version="1.0" encoding="utf-8"?>
 <w:numbering xmlns:wpc="http://schemas.microsoft.com/office/word/2010/wordprocessingCanvas" xmlns:mo="http://schemas.microsoft.com/office/mac/office/2008/main" xmlns:mc="http://schemas.openxmlformats.org/markup-compatibility/2006" xmlns:mv="urn:schemas-microsoft-com:mac:vml" xmlns:o="urn:schemas-microsoft-com:office:office" xmlns:r="http://schemas.openxmlformats.org/officeDocument/2006/relationships" xmlns:m="http://schemas.openxmlformats.org/officeDocument/2006/math" xmlns:v="urn:schemas-microsoft-com:vml" xmlns:wp14="http://schemas.microsoft.com/office/word/2010/wordprocessingDrawing" xmlns:wp="http://schemas.openxmlformats.org/drawingml/2006/wordprocessingDrawing" xmlns:w10="urn:schemas-microsoft-com:office:word" xmlns:w="http://schemas.openxmlformats.org/wordprocessingml/2006/main" xmlns:w14="http://schemas.microsoft.com/office/word/2010/wordml" xmlns:wpg="http://schemas.microsoft.com/office/word/2010/wordprocessingGroup" xmlns:wpi="http://schemas.microsoft.com/office/word/2010/wordprocessingInk" xmlns:wne="http://schemas.microsoft.com/office/word/2006/wordml" xmlns:wps="http://schemas.microsoft.com/office/word/2010/wordprocessingShape" mc:Ignorable="w14 wp14">
   <w:abstractNum w:abstractNumId="0">

</xml_diff>

<commit_message>
Masked the class diagram socket into a single half-circle, wrapped the lifeline heads and rewrote the hardware estimate as numbered Word formulas
</commit_message>
<xml_diff>
--- a/docs/lab4-rpz.docx
+++ b/docs/lab4-rpz.docx
@@ -764,7 +764,7 @@
           <w:color w:val="000000"/>
           <w:sz w:val="28"/>
         </w:rPr>
-        <w:t>1 ДИАГРАММЫ СИСТЕМЫ</w:t>
+        <w:t>АРХИТЕКТУРА</w:t>
       </w:r>
     </w:p>
     <w:p>
@@ -785,28 +785,7 @@
           <w:sz w:val="28"/>
           <w:u w:val="none"/>
         </w:rPr>
-        <w:t>В разделе приведены три диаграммы веб-сервиса учёта удельных княжеств Древней Руси, построенные в StarUML по ходу лабораторных работ 2–4.</w:t>
-      </w:r>
-    </w:p>
-    <w:p>
-      <w:pPr>
-        <w:keepNext w:val="0"/>
-        <w:pageBreakBefore w:val="0"/>
-        <w:widowControl/>
-        <w:spacing w:line="360" w:lineRule="auto" w:before="0" w:after="0"/>
-        <w:ind w:firstLine="709" w:left="0" w:right="0"/>
-        <w:jc w:val="both"/>
-      </w:pPr>
-      <w:r>
-        <w:rPr>
-          <w:rFonts w:ascii="Times New Roman" w:hAnsi="Times New Roman" w:eastAsia="Times New Roman" w:cs="Times New Roman"/>
-          <w:b w:val="0"/>
-          <w:i w:val="0"/>
-          <w:color w:val="000000"/>
-          <w:sz w:val="28"/>
-          <w:u w:val="none"/>
-        </w:rPr>
-        <w:t>ER-диаграмма (рисунок 1) описывает три таблицы базы данных PostgreSQL: «Княжество» (principality) с двумя полями по теме — датой основания и коэффициентом земли, «Археолог» (archaeologist) и «Лайк княжества» (principality_like), которая связывает археологов и княжества отношением «многие-ко-многим». Внешние ключи заданы без каскадного удаления: княжество удаляется логически переводом в статус removed.</w:t>
+        <w:t>Схема базы данных приведена на рисунке 1. Структура классов веб-сервиса приведена на рисунке 2.</w:t>
       </w:r>
     </w:p>
     <w:p>
@@ -829,7 +808,7 @@
         </w:rPr>
         <w:drawing>
           <wp:inline xmlns:a="http://schemas.openxmlformats.org/drawingml/2006/main" xmlns:pic="http://schemas.openxmlformats.org/drawingml/2006/picture">
-            <wp:extent cx="5760000" cy="2776419"/>
+            <wp:extent cx="5760000" cy="2813023"/>
             <wp:docPr id="2" name="Picture 2"/>
             <wp:cNvGraphicFramePr>
               <a:graphicFrameLocks noChangeAspect="1"/>
@@ -850,7 +829,7 @@
                   <pic:spPr>
                     <a:xfrm>
                       <a:off x="0" y="0"/>
-                      <a:ext cx="5760000" cy="2776419"/>
+                      <a:ext cx="5760000" cy="2813023"/>
                     </a:xfrm>
                     <a:prstGeom prst="rect"/>
                   </pic:spPr>
@@ -879,28 +858,7 @@
           <w:sz w:val="28"/>
           <w:u w:val="none"/>
         </w:rPr>
-        <w:t>Рисунок 1 – ER-диаграмма базы данных княжеств, археологов и лайков</w:t>
-      </w:r>
-    </w:p>
-    <w:p>
-      <w:pPr>
-        <w:keepNext w:val="0"/>
-        <w:pageBreakBefore w:val="0"/>
-        <w:widowControl/>
-        <w:spacing w:line="360" w:lineRule="auto" w:before="0" w:after="0"/>
-        <w:ind w:firstLine="709" w:left="0" w:right="0"/>
-        <w:jc w:val="both"/>
-      </w:pPr>
-      <w:r>
-        <w:rPr>
-          <w:rFonts w:ascii="Times New Roman" w:hAnsi="Times New Roman" w:eastAsia="Times New Roman" w:cs="Times New Roman"/>
-          <w:b w:val="0"/>
-          <w:i w:val="0"/>
-          <w:color w:val="000000"/>
-          <w:sz w:val="28"/>
-          <w:u w:val="none"/>
-        </w:rPr>
-        <w:t>Диаграмма классов (рисунок 2) показывает слои системы: четыре страницы React-приложения («Лента княжеств», «Плитка княжеств», «Добавление княжества», «Вход археолога») обращаются через API княжеств и API археологов к доменам веб-сервиса, домены работают с классами модели «Княжество», «Лайк», «Археолог», а модель отображается на таблицы базы данных.</w:t>
+        <w:t>Рисунок 1 – ER-диаграмма базы данных</w:t>
       </w:r>
     </w:p>
     <w:p>
@@ -923,7 +881,7 @@
         </w:rPr>
         <w:drawing>
           <wp:inline xmlns:a="http://schemas.openxmlformats.org/drawingml/2006/main" xmlns:pic="http://schemas.openxmlformats.org/drawingml/2006/picture">
-            <wp:extent cx="5460807" cy="6119999"/>
+            <wp:extent cx="5547442" cy="6119999"/>
             <wp:docPr id="3" name="Picture 3"/>
             <wp:cNvGraphicFramePr>
               <a:graphicFrameLocks noChangeAspect="1"/>
@@ -944,7 +902,7 @@
                   <pic:spPr>
                     <a:xfrm>
                       <a:off x="0" y="0"/>
-                      <a:ext cx="5460807" cy="6119999"/>
+                      <a:ext cx="5547442" cy="6119999"/>
                     </a:xfrm>
                     <a:prstGeom prst="rect"/>
                   </pic:spPr>
@@ -973,7 +931,27 @@
           <w:sz w:val="28"/>
           <w:u w:val="none"/>
         </w:rPr>
-        <w:t>Рисунок 2 – Диаграмма классов системы</w:t>
+        <w:t>Рисунок 2 – Диаграмма классов</w:t>
+      </w:r>
+    </w:p>
+    <w:p>
+      <w:pPr>
+        <w:pStyle w:val="Heading1"/>
+        <w:keepNext/>
+        <w:pageBreakBefore/>
+        <w:widowControl/>
+        <w:spacing w:line="360" w:lineRule="auto" w:before="0" w:after="240"/>
+        <w:ind w:firstLine="0" w:left="0" w:right="0"/>
+        <w:jc w:val="center"/>
+      </w:pPr>
+      <w:r>
+        <w:rPr>
+          <w:rFonts w:ascii="Times New Roman" w:hAnsi="Times New Roman" w:eastAsia="Times New Roman" w:cs="Times New Roman"/>
+          <w:b/>
+          <w:color w:val="000000"/>
+          <w:sz w:val="28"/>
+        </w:rPr>
+        <w:t>АЛГОРИТМЫ</w:t>
       </w:r>
     </w:p>
     <w:p>
@@ -994,20 +972,8 @@
           <w:sz w:val="28"/>
           <w:u w:val="none"/>
         </w:rPr>
-        <w:t>Диаграмма последовательности (рисунок 3) описывает работу археолога с веб-сервисом: аутентификацию, получение списка княжеств с фильтром по дате основания, добавление княжества с изображением и видео, получение черновика и его публикацию, просмотр ленты и лайк. Линии жизни — страницы React-приложения и домены веб-сервиса, сообщения — HTTP-методы из диаграммы классов с ключевыми входными и выходными данными.</w:t>
+        <w:t>Последовательность HTTP-запросов приведена на рисунке 3.</w:t>
       </w:r>
-    </w:p>
-    <w:p>
-      <w:pPr>
-        <w:sectPr>
-          <w:footerReference w:type="default" r:id="rId9"/>
-          <w:pgSz w:w="11906" w:h="16838"/>
-          <w:pgMar w:top="1134" w:right="850" w:bottom="1134" w:left="1701" w:header="720" w:footer="567" w:gutter="0"/>
-          <w:cols w:space="720"/>
-          <w:titlePg/>
-          <w:docGrid w:linePitch="360"/>
-        </w:sectPr>
-      </w:pPr>
     </w:p>
     <w:p>
       <w:pPr>
@@ -1029,7 +995,7 @@
         </w:rPr>
         <w:drawing>
           <wp:inline xmlns:a="http://schemas.openxmlformats.org/drawingml/2006/main" xmlns:pic="http://schemas.openxmlformats.org/drawingml/2006/picture">
-            <wp:extent cx="7680946" cy="5471999"/>
+            <wp:extent cx="5443341" cy="6119999"/>
             <wp:docPr id="4" name="Picture 4"/>
             <wp:cNvGraphicFramePr>
               <a:graphicFrameLocks noChangeAspect="1"/>
@@ -1050,7 +1016,7 @@
                   <pic:spPr>
                     <a:xfrm>
                       <a:off x="0" y="0"/>
-                      <a:ext cx="7680946" cy="5471999"/>
+                      <a:ext cx="5443341" cy="6119999"/>
                     </a:xfrm>
                     <a:prstGeom prst="rect"/>
                   </pic:spPr>
@@ -1079,15 +1045,851 @@
           <w:sz w:val="28"/>
           <w:u w:val="none"/>
         </w:rPr>
-        <w:t>Рисунок 3 – Диаграмма последовательности HTTP-запросов</w:t>
+        <w:t>Рисунок 3 – Диаграмма последовательности</w:t>
+      </w:r>
+    </w:p>
+    <w:p>
+      <w:pPr>
+        <w:keepNext w:val="0"/>
+        <w:pageBreakBefore w:val="0"/>
+        <w:widowControl/>
+        <w:spacing w:line="360" w:lineRule="auto" w:before="0" w:after="0"/>
+        <w:ind w:firstLine="709" w:left="0" w:right="0"/>
+        <w:jc w:val="both"/>
+      </w:pPr>
+      <w:r>
+        <w:rPr>
+          <w:rFonts w:ascii="Times New Roman" w:hAnsi="Times New Roman" w:eastAsia="Times New Roman" w:cs="Times New Roman"/>
+          <w:b w:val="0"/>
+          <w:i w:val="0"/>
+          <w:color w:val="000000"/>
+          <w:sz w:val="28"/>
+          <w:u w:val="none"/>
+        </w:rPr>
+        <w:t>Расчёт выполнен для сервера с веб-сервисом, PostgreSQL, Minio и Redis. В системе работают 160 археологов — штат Института археологии РАН (буклет института, archaeolog.ru, 2016), рабочий день 8 часов, то есть 28 800 секунд, археолог просматривает 10 княжеств в день. Суточное количество княжеств — формула 1.</w:t>
+      </w:r>
+    </w:p>
+    <w:p>
+      <w:pPr>
+        <w:keepNext w:val="0"/>
+        <w:pageBreakBefore w:val="0"/>
+        <w:widowControl/>
+        <w:tabs>
+          <w:tab w:pos="4677" w:val="center"/>
+          <w:tab w:pos="9354" w:val="right"/>
+        </w:tabs>
+        <w:spacing w:line="360" w:lineRule="auto" w:before="0" w:after="0"/>
+        <w:ind w:firstLine="0" w:left="0" w:right="0"/>
+        <w:jc w:val="both"/>
+      </w:pPr>
+      <w:r>
+        <w:rPr>
+          <w:rFonts w:ascii="Times New Roman" w:hAnsi="Times New Roman" w:eastAsia="Times New Roman" w:cs="Times New Roman"/>
+          <w:b w:val="0"/>
+          <w:i w:val="0"/>
+          <w:color w:val="000000"/>
+          <w:sz w:val="28"/>
+          <w:u w:val="none"/>
+        </w:rPr>
+        <w:tab/>
+      </w:r>
+      <m:oMath>
+        <m:sSub>
+          <m:e>
+            <m:r>
+              <w:rPr>
+                <w:sz w:val="28"/>
+              </w:rPr>
+              <m:t xml:space="preserve">N</m:t>
+            </m:r>
+          </m:e>
+          <m:sub>
+            <m:r>
+              <w:rPr>
+                <w:sz w:val="28"/>
+              </w:rPr>
+              <m:t xml:space="preserve">сут</m:t>
+            </m:r>
+          </m:sub>
+        </m:sSub>
+        <m:r>
+          <w:rPr>
+            <w:sz w:val="28"/>
+          </w:rPr>
+          <m:t xml:space="preserve"> = 160 · 10 = 1 600 княжеств в сутки</m:t>
+        </m:r>
+      </m:oMath>
+      <w:r>
+        <w:rPr>
+          <w:rFonts w:ascii="Times New Roman" w:hAnsi="Times New Roman" w:eastAsia="Times New Roman" w:cs="Times New Roman"/>
+          <w:color w:val="000000"/>
+          <w:sz w:val="28"/>
+        </w:rPr>
+        <w:tab/>
+        <w:t>(1)</w:t>
+      </w:r>
+    </w:p>
+    <w:p>
+      <w:pPr>
+        <w:keepNext w:val="0"/>
+        <w:pageBreakBefore w:val="0"/>
+        <w:widowControl/>
+        <w:spacing w:line="360" w:lineRule="auto" w:before="0" w:after="0"/>
+        <w:ind w:firstLine="709" w:left="0" w:right="0"/>
+        <w:jc w:val="both"/>
+      </w:pPr>
+      <w:r>
+        <w:rPr>
+          <w:rFonts w:ascii="Times New Roman" w:hAnsi="Times New Roman" w:eastAsia="Times New Roman" w:cs="Times New Roman"/>
+          <w:b w:val="0"/>
+          <w:i w:val="0"/>
+          <w:color w:val="000000"/>
+          <w:sz w:val="28"/>
+          <w:u w:val="none"/>
+        </w:rPr>
+        <w:t>На одно княжество по диаграмме последовательности приходится 8 HTTP-запросов: вход, плитка, добавление, черновик, публикация, лента, следующее княжество, лайк. RPS вычисляется по формуле 2.</w:t>
+      </w:r>
+    </w:p>
+    <w:p>
+      <w:pPr>
+        <w:keepNext w:val="0"/>
+        <w:pageBreakBefore w:val="0"/>
+        <w:widowControl/>
+        <w:tabs>
+          <w:tab w:pos="4677" w:val="center"/>
+          <w:tab w:pos="9354" w:val="right"/>
+        </w:tabs>
+        <w:spacing w:line="360" w:lineRule="auto" w:before="0" w:after="0"/>
+        <w:ind w:firstLine="0" w:left="0" w:right="0"/>
+        <w:jc w:val="both"/>
+      </w:pPr>
+      <w:r>
+        <w:rPr>
+          <w:rFonts w:ascii="Times New Roman" w:hAnsi="Times New Roman" w:eastAsia="Times New Roman" w:cs="Times New Roman"/>
+          <w:b w:val="0"/>
+          <w:i w:val="0"/>
+          <w:color w:val="000000"/>
+          <w:sz w:val="28"/>
+          <w:u w:val="none"/>
+        </w:rPr>
+        <w:tab/>
+      </w:r>
+      <m:oMath>
+        <m:r>
+          <w:rPr>
+            <w:sz w:val="28"/>
+          </w:rPr>
+          <m:t xml:space="preserve">RPS = </m:t>
+        </m:r>
+        <m:f>
+          <m:num>
+            <m:r>
+              <w:rPr>
+                <w:sz w:val="28"/>
+              </w:rPr>
+              <m:t xml:space="preserve">1 600 · 8</m:t>
+            </m:r>
+          </m:num>
+          <m:den>
+            <m:r>
+              <w:rPr>
+                <w:sz w:val="28"/>
+              </w:rPr>
+              <m:t xml:space="preserve">28 800</m:t>
+            </m:r>
+          </m:den>
+        </m:f>
+        <m:r>
+          <w:rPr>
+            <w:sz w:val="28"/>
+          </w:rPr>
+          <m:t xml:space="preserve"> ≈ 0,44 запроса в секунду</m:t>
+        </m:r>
+      </m:oMath>
+      <w:r>
+        <w:rPr>
+          <w:rFonts w:ascii="Times New Roman" w:hAnsi="Times New Roman" w:eastAsia="Times New Roman" w:cs="Times New Roman"/>
+          <w:color w:val="000000"/>
+          <w:sz w:val="28"/>
+        </w:rPr>
+        <w:tab/>
+        <w:t>(2)</w:t>
+      </w:r>
+    </w:p>
+    <w:p>
+      <w:pPr>
+        <w:keepNext w:val="0"/>
+        <w:pageBreakBefore w:val="0"/>
+        <w:widowControl/>
+        <w:spacing w:line="360" w:lineRule="auto" w:before="0" w:after="0"/>
+        <w:ind w:firstLine="709" w:left="0" w:right="0"/>
+        <w:jc w:val="both"/>
+      </w:pPr>
+      <w:r>
+        <w:rPr>
+          <w:rFonts w:ascii="Times New Roman" w:hAnsi="Times New Roman" w:eastAsia="Times New Roman" w:cs="Times New Roman"/>
+          <w:b w:val="0"/>
+          <w:i w:val="0"/>
+          <w:color w:val="000000"/>
+          <w:sz w:val="28"/>
+          <w:u w:val="none"/>
+        </w:rPr>
+        <w:t>Число ядер — формула 3 при производительности ядра 1 418 запросов в секунду (ab -n 3000 -c 20 на GET /api/principalities при GOMAXPROCS=1) и коэффициенте запаса 1,5; принимаются 2 ядра, так как на сервере также работают PostgreSQL, Redis и Minio. Оперативная память — формула 4 из нормы 4 ГБ на ядро.</w:t>
+      </w:r>
+    </w:p>
+    <w:p>
+      <w:pPr>
+        <w:keepNext w:val="0"/>
+        <w:pageBreakBefore w:val="0"/>
+        <w:widowControl/>
+        <w:tabs>
+          <w:tab w:pos="4677" w:val="center"/>
+          <w:tab w:pos="9354" w:val="right"/>
+        </w:tabs>
+        <w:spacing w:line="360" w:lineRule="auto" w:before="0" w:after="0"/>
+        <w:ind w:firstLine="0" w:left="0" w:right="0"/>
+        <w:jc w:val="both"/>
+      </w:pPr>
+      <w:r>
+        <w:rPr>
+          <w:rFonts w:ascii="Times New Roman" w:hAnsi="Times New Roman" w:eastAsia="Times New Roman" w:cs="Times New Roman"/>
+          <w:b w:val="0"/>
+          <w:i w:val="0"/>
+          <w:color w:val="000000"/>
+          <w:sz w:val="28"/>
+          <w:u w:val="none"/>
+        </w:rPr>
+        <w:tab/>
+      </w:r>
+      <m:oMath>
+        <m:sSub>
+          <m:e>
+            <m:r>
+              <w:rPr>
+                <w:sz w:val="28"/>
+              </w:rPr>
+              <m:t xml:space="preserve">N</m:t>
+            </m:r>
+          </m:e>
+          <m:sub>
+            <m:r>
+              <w:rPr>
+                <w:sz w:val="28"/>
+              </w:rPr>
+              <m:t xml:space="preserve">ядер</m:t>
+            </m:r>
+          </m:sub>
+        </m:sSub>
+        <m:r>
+          <w:rPr>
+            <w:sz w:val="28"/>
+          </w:rPr>
+          <m:t xml:space="preserve"> = </m:t>
+        </m:r>
+        <m:f>
+          <m:num>
+            <m:r>
+              <w:rPr>
+                <w:sz w:val="28"/>
+              </w:rPr>
+              <m:t xml:space="preserve">RPS</m:t>
+            </m:r>
+          </m:num>
+          <m:den>
+            <m:sSub>
+              <m:e>
+                <m:r>
+                  <w:rPr>
+                    <w:sz w:val="28"/>
+                  </w:rPr>
+                  <m:t xml:space="preserve">RPS</m:t>
+                </m:r>
+              </m:e>
+              <m:sub>
+                <m:r>
+                  <w:rPr>
+                    <w:sz w:val="28"/>
+                  </w:rPr>
+                  <m:t xml:space="preserve">ядра</m:t>
+                </m:r>
+              </m:sub>
+            </m:sSub>
+          </m:den>
+        </m:f>
+        <m:r>
+          <w:rPr>
+            <w:sz w:val="28"/>
+          </w:rPr>
+          <m:t xml:space="preserve"> · </m:t>
+        </m:r>
+        <m:sSub>
+          <m:e>
+            <m:r>
+              <w:rPr>
+                <w:sz w:val="28"/>
+              </w:rPr>
+              <m:t xml:space="preserve">k</m:t>
+            </m:r>
+          </m:e>
+          <m:sub>
+            <m:r>
+              <w:rPr>
+                <w:sz w:val="28"/>
+              </w:rPr>
+              <m:t xml:space="preserve">зап</m:t>
+            </m:r>
+          </m:sub>
+        </m:sSub>
+        <m:r>
+          <w:rPr>
+            <w:sz w:val="28"/>
+          </w:rPr>
+          <m:t xml:space="preserve"> = </m:t>
+        </m:r>
+        <m:f>
+          <m:num>
+            <m:r>
+              <w:rPr>
+                <w:sz w:val="28"/>
+              </w:rPr>
+              <m:t xml:space="preserve">0,44</m:t>
+            </m:r>
+          </m:num>
+          <m:den>
+            <m:r>
+              <w:rPr>
+                <w:sz w:val="28"/>
+              </w:rPr>
+              <m:t xml:space="preserve">1 418</m:t>
+            </m:r>
+          </m:den>
+        </m:f>
+        <m:r>
+          <w:rPr>
+            <w:sz w:val="28"/>
+          </w:rPr>
+          <m:t xml:space="preserve"> · 1,5 ≈ 0,0005 → 2 ядра</m:t>
+        </m:r>
+      </m:oMath>
+      <w:r>
+        <w:rPr>
+          <w:rFonts w:ascii="Times New Roman" w:hAnsi="Times New Roman" w:eastAsia="Times New Roman" w:cs="Times New Roman"/>
+          <w:color w:val="000000"/>
+          <w:sz w:val="28"/>
+        </w:rPr>
+        <w:tab/>
+        <w:t>(3)</w:t>
+      </w:r>
+    </w:p>
+    <w:p>
+      <w:pPr>
+        <w:keepNext w:val="0"/>
+        <w:pageBreakBefore w:val="0"/>
+        <w:widowControl/>
+        <w:tabs>
+          <w:tab w:pos="4677" w:val="center"/>
+          <w:tab w:pos="9354" w:val="right"/>
+        </w:tabs>
+        <w:spacing w:line="360" w:lineRule="auto" w:before="0" w:after="0"/>
+        <w:ind w:firstLine="0" w:left="0" w:right="0"/>
+        <w:jc w:val="both"/>
+      </w:pPr>
+      <w:r>
+        <w:rPr>
+          <w:rFonts w:ascii="Times New Roman" w:hAnsi="Times New Roman" w:eastAsia="Times New Roman" w:cs="Times New Roman"/>
+          <w:b w:val="0"/>
+          <w:i w:val="0"/>
+          <w:color w:val="000000"/>
+          <w:sz w:val="28"/>
+          <w:u w:val="none"/>
+        </w:rPr>
+        <w:tab/>
+      </w:r>
+      <m:oMath>
+        <m:r>
+          <w:rPr>
+            <w:sz w:val="28"/>
+          </w:rPr>
+          <m:t xml:space="preserve">ОП = 4 · </m:t>
+        </m:r>
+        <m:sSub>
+          <m:e>
+            <m:r>
+              <w:rPr>
+                <w:sz w:val="28"/>
+              </w:rPr>
+              <m:t xml:space="preserve">N</m:t>
+            </m:r>
+          </m:e>
+          <m:sub>
+            <m:r>
+              <w:rPr>
+                <w:sz w:val="28"/>
+              </w:rPr>
+              <m:t xml:space="preserve">ядер</m:t>
+            </m:r>
+          </m:sub>
+        </m:sSub>
+        <m:r>
+          <w:rPr>
+            <w:sz w:val="28"/>
+          </w:rPr>
+          <m:t xml:space="preserve"> = 4 · 2 = 8 ГБ</m:t>
+        </m:r>
+      </m:oMath>
+      <w:r>
+        <w:rPr>
+          <w:rFonts w:ascii="Times New Roman" w:hAnsi="Times New Roman" w:eastAsia="Times New Roman" w:cs="Times New Roman"/>
+          <w:color w:val="000000"/>
+          <w:sz w:val="28"/>
+        </w:rPr>
+        <w:tab/>
+        <w:t>(4)</w:t>
+      </w:r>
+    </w:p>
+    <w:p>
+      <w:pPr>
+        <w:keepNext w:val="0"/>
+        <w:pageBreakBefore w:val="0"/>
+        <w:widowControl/>
+        <w:spacing w:line="360" w:lineRule="auto" w:before="0" w:after="0"/>
+        <w:ind w:firstLine="709" w:left="0" w:right="0"/>
+        <w:jc w:val="both"/>
+      </w:pPr>
+      <w:r>
+        <w:rPr>
+          <w:rFonts w:ascii="Times New Roman" w:hAnsi="Times New Roman" w:eastAsia="Times New Roman" w:cs="Times New Roman"/>
+          <w:b w:val="0"/>
+          <w:i w:val="0"/>
+          <w:color w:val="000000"/>
+          <w:sz w:val="28"/>
+          <w:u w:val="none"/>
+        </w:rPr>
+        <w:t>Размер записи principality — формула 5: заголовок строки 24 Б, два идентификатора по 4 Б, название varchar(120) 241 Б, описание varchar(600) 1 201 Б, статус varchar(16) 33 Б, два ключа медиа varchar(80) по 161 Б, дата основания 4 Б, коэффициент земли и две даты по 8 Б. Запись principality_like 36 Б, изображение и видео княжества 749 КБ и 948 КБ.</w:t>
+      </w:r>
+    </w:p>
+    <w:p>
+      <w:pPr>
+        <w:keepNext w:val="0"/>
+        <w:pageBreakBefore w:val="0"/>
+        <w:widowControl/>
+        <w:tabs>
+          <w:tab w:pos="4677" w:val="center"/>
+          <w:tab w:pos="9354" w:val="right"/>
+        </w:tabs>
+        <w:spacing w:line="360" w:lineRule="auto" w:before="0" w:after="0"/>
+        <w:ind w:firstLine="0" w:left="0" w:right="0"/>
+        <w:jc w:val="both"/>
+      </w:pPr>
+      <w:r>
+        <w:rPr>
+          <w:rFonts w:ascii="Times New Roman" w:hAnsi="Times New Roman" w:eastAsia="Times New Roman" w:cs="Times New Roman"/>
+          <w:b w:val="0"/>
+          <w:i w:val="0"/>
+          <w:color w:val="000000"/>
+          <w:sz w:val="28"/>
+          <w:u w:val="none"/>
+        </w:rPr>
+        <w:tab/>
+      </w:r>
+      <m:oMath>
+        <m:sSub>
+          <m:e>
+            <m:r>
+              <w:rPr>
+                <w:sz w:val="28"/>
+              </w:rPr>
+              <m:t xml:space="preserve">S</m:t>
+            </m:r>
+          </m:e>
+          <m:sub>
+            <m:r>
+              <w:rPr>
+                <w:sz w:val="28"/>
+              </w:rPr>
+              <m:t xml:space="preserve">княж</m:t>
+            </m:r>
+          </m:sub>
+        </m:sSub>
+        <m:r>
+          <w:rPr>
+            <w:sz w:val="28"/>
+          </w:rPr>
+          <m:t xml:space="preserve"> = 24 + 4 · 2 + 241 + 1 201 + 33 + 161 · 2 + 4 + 8 · 3 = 1 857 Б</m:t>
+        </m:r>
+      </m:oMath>
+      <w:r>
+        <w:rPr>
+          <w:rFonts w:ascii="Times New Roman" w:hAnsi="Times New Roman" w:eastAsia="Times New Roman" w:cs="Times New Roman"/>
+          <w:color w:val="000000"/>
+          <w:sz w:val="28"/>
+        </w:rPr>
+        <w:tab/>
+        <w:t>(5)</w:t>
+      </w:r>
+    </w:p>
+    <w:p>
+      <w:pPr>
+        <w:keepNext w:val="0"/>
+        <w:pageBreakBefore w:val="0"/>
+        <w:widowControl/>
+        <w:spacing w:line="360" w:lineRule="auto" w:before="0" w:after="0"/>
+        <w:ind w:firstLine="709" w:left="0" w:right="0"/>
+        <w:jc w:val="both"/>
+      </w:pPr>
+      <w:r>
+        <w:rPr>
+          <w:rFonts w:ascii="Times New Roman" w:hAnsi="Times New Roman" w:eastAsia="Times New Roman" w:cs="Times New Roman"/>
+          <w:b w:val="0"/>
+          <w:i w:val="0"/>
+          <w:color w:val="000000"/>
+          <w:sz w:val="28"/>
+          <w:u w:val="none"/>
+        </w:rPr>
+        <w:t>В день публикуется 50 княжеств, годовое количество — формула 6. Каждый археолог ставит 5 лайков в день, то есть 292 000 лайков в год; прирост базы данных — формула 7, прирост Minio — формула 8, объём диска за 5 лет с резервом 10 ГБ — формула 9.</w:t>
+      </w:r>
+    </w:p>
+    <w:p>
+      <w:pPr>
+        <w:keepNext w:val="0"/>
+        <w:pageBreakBefore w:val="0"/>
+        <w:widowControl/>
+        <w:tabs>
+          <w:tab w:pos="4677" w:val="center"/>
+          <w:tab w:pos="9354" w:val="right"/>
+        </w:tabs>
+        <w:spacing w:line="360" w:lineRule="auto" w:before="0" w:after="0"/>
+        <w:ind w:firstLine="0" w:left="0" w:right="0"/>
+        <w:jc w:val="both"/>
+      </w:pPr>
+      <w:r>
+        <w:rPr>
+          <w:rFonts w:ascii="Times New Roman" w:hAnsi="Times New Roman" w:eastAsia="Times New Roman" w:cs="Times New Roman"/>
+          <w:b w:val="0"/>
+          <w:i w:val="0"/>
+          <w:color w:val="000000"/>
+          <w:sz w:val="28"/>
+          <w:u w:val="none"/>
+        </w:rPr>
+        <w:tab/>
+      </w:r>
+      <m:oMath>
+        <m:sSub>
+          <m:e>
+            <m:r>
+              <w:rPr>
+                <w:sz w:val="28"/>
+              </w:rPr>
+              <m:t xml:space="preserve">N</m:t>
+            </m:r>
+          </m:e>
+          <m:sub>
+            <m:r>
+              <w:rPr>
+                <w:sz w:val="28"/>
+              </w:rPr>
+              <m:t xml:space="preserve">год</m:t>
+            </m:r>
+          </m:sub>
+        </m:sSub>
+        <m:r>
+          <w:rPr>
+            <w:sz w:val="28"/>
+          </w:rPr>
+          <m:t xml:space="preserve"> = 50 · 365 = 18 250 княжеств в год</m:t>
+        </m:r>
+      </m:oMath>
+      <w:r>
+        <w:rPr>
+          <w:rFonts w:ascii="Times New Roman" w:hAnsi="Times New Roman" w:eastAsia="Times New Roman" w:cs="Times New Roman"/>
+          <w:color w:val="000000"/>
+          <w:sz w:val="28"/>
+        </w:rPr>
+        <w:tab/>
+        <w:t>(6)</w:t>
+      </w:r>
+    </w:p>
+    <w:p>
+      <w:pPr>
+        <w:keepNext w:val="0"/>
+        <w:pageBreakBefore w:val="0"/>
+        <w:widowControl/>
+        <w:tabs>
+          <w:tab w:pos="4677" w:val="center"/>
+          <w:tab w:pos="9354" w:val="right"/>
+        </w:tabs>
+        <w:spacing w:line="360" w:lineRule="auto" w:before="0" w:after="0"/>
+        <w:ind w:firstLine="0" w:left="0" w:right="0"/>
+        <w:jc w:val="both"/>
+      </w:pPr>
+      <w:r>
+        <w:rPr>
+          <w:rFonts w:ascii="Times New Roman" w:hAnsi="Times New Roman" w:eastAsia="Times New Roman" w:cs="Times New Roman"/>
+          <w:b w:val="0"/>
+          <w:i w:val="0"/>
+          <w:color w:val="000000"/>
+          <w:sz w:val="28"/>
+          <w:u w:val="none"/>
+        </w:rPr>
+        <w:tab/>
+      </w:r>
+      <m:oMath>
+        <m:sSub>
+          <m:e>
+            <m:r>
+              <w:rPr>
+                <w:sz w:val="28"/>
+              </w:rPr>
+              <m:t xml:space="preserve">V</m:t>
+            </m:r>
+          </m:e>
+          <m:sub>
+            <m:r>
+              <w:rPr>
+                <w:sz w:val="28"/>
+              </w:rPr>
+              <m:t xml:space="preserve">БД</m:t>
+            </m:r>
+          </m:sub>
+        </m:sSub>
+        <m:r>
+          <w:rPr>
+            <w:sz w:val="28"/>
+          </w:rPr>
+          <m:t xml:space="preserve"> = </m:t>
+        </m:r>
+        <m:f>
+          <m:num>
+            <m:r>
+              <w:rPr>
+                <w:sz w:val="28"/>
+              </w:rPr>
+              <m:t xml:space="preserve">18 250 · 1 857 + 292 000 · 36</m:t>
+            </m:r>
+          </m:num>
+          <m:den>
+            <m:sSup>
+              <m:e>
+                <m:r>
+                  <w:rPr>
+                    <w:sz w:val="28"/>
+                  </w:rPr>
+                  <m:t xml:space="preserve">1024</m:t>
+                </m:r>
+              </m:e>
+              <m:sup>
+                <m:r>
+                  <w:rPr>
+                    <w:sz w:val="28"/>
+                  </w:rPr>
+                  <m:t xml:space="preserve">3</m:t>
+                </m:r>
+              </m:sup>
+            </m:sSup>
+          </m:den>
+        </m:f>
+        <m:r>
+          <w:rPr>
+            <w:sz w:val="28"/>
+          </w:rPr>
+          <m:t xml:space="preserve"> ≈ 0,04 ГБ</m:t>
+        </m:r>
+      </m:oMath>
+      <w:r>
+        <w:rPr>
+          <w:rFonts w:ascii="Times New Roman" w:hAnsi="Times New Roman" w:eastAsia="Times New Roman" w:cs="Times New Roman"/>
+          <w:color w:val="000000"/>
+          <w:sz w:val="28"/>
+        </w:rPr>
+        <w:tab/>
+        <w:t>(7)</w:t>
+      </w:r>
+    </w:p>
+    <w:p>
+      <w:pPr>
+        <w:keepNext w:val="0"/>
+        <w:pageBreakBefore w:val="0"/>
+        <w:widowControl/>
+        <w:tabs>
+          <w:tab w:pos="4677" w:val="center"/>
+          <w:tab w:pos="9354" w:val="right"/>
+        </w:tabs>
+        <w:spacing w:line="360" w:lineRule="auto" w:before="0" w:after="0"/>
+        <w:ind w:firstLine="0" w:left="0" w:right="0"/>
+        <w:jc w:val="both"/>
+      </w:pPr>
+      <w:r>
+        <w:rPr>
+          <w:rFonts w:ascii="Times New Roman" w:hAnsi="Times New Roman" w:eastAsia="Times New Roman" w:cs="Times New Roman"/>
+          <w:b w:val="0"/>
+          <w:i w:val="0"/>
+          <w:color w:val="000000"/>
+          <w:sz w:val="28"/>
+          <w:u w:val="none"/>
+        </w:rPr>
+        <w:tab/>
+      </w:r>
+      <m:oMath>
+        <m:sSub>
+          <m:e>
+            <m:r>
+              <w:rPr>
+                <w:sz w:val="28"/>
+              </w:rPr>
+              <m:t xml:space="preserve">V</m:t>
+            </m:r>
+          </m:e>
+          <m:sub>
+            <m:r>
+              <w:rPr>
+                <w:sz w:val="28"/>
+              </w:rPr>
+              <m:t xml:space="preserve">Minio</m:t>
+            </m:r>
+          </m:sub>
+        </m:sSub>
+        <m:r>
+          <w:rPr>
+            <w:sz w:val="28"/>
+          </w:rPr>
+          <m:t xml:space="preserve"> = </m:t>
+        </m:r>
+        <m:f>
+          <m:num>
+            <m:r>
+              <w:rPr>
+                <w:sz w:val="28"/>
+              </w:rPr>
+              <m:t xml:space="preserve">18 250 · (749 + 948)</m:t>
+            </m:r>
+          </m:num>
+          <m:den>
+            <m:sSup>
+              <m:e>
+                <m:r>
+                  <w:rPr>
+                    <w:sz w:val="28"/>
+                  </w:rPr>
+                  <m:t xml:space="preserve">1024</m:t>
+                </m:r>
+              </m:e>
+              <m:sup>
+                <m:r>
+                  <w:rPr>
+                    <w:sz w:val="28"/>
+                  </w:rPr>
+                  <m:t xml:space="preserve">2</m:t>
+                </m:r>
+              </m:sup>
+            </m:sSup>
+          </m:den>
+        </m:f>
+        <m:r>
+          <w:rPr>
+            <w:sz w:val="28"/>
+          </w:rPr>
+          <m:t xml:space="preserve"> ≈ 29,5 ГБ</m:t>
+        </m:r>
+      </m:oMath>
+      <w:r>
+        <w:rPr>
+          <w:rFonts w:ascii="Times New Roman" w:hAnsi="Times New Roman" w:eastAsia="Times New Roman" w:cs="Times New Roman"/>
+          <w:color w:val="000000"/>
+          <w:sz w:val="28"/>
+        </w:rPr>
+        <w:tab/>
+        <w:t>(8)</w:t>
+      </w:r>
+    </w:p>
+    <w:p>
+      <w:pPr>
+        <w:keepNext w:val="0"/>
+        <w:pageBreakBefore w:val="0"/>
+        <w:widowControl/>
+        <w:tabs>
+          <w:tab w:pos="4677" w:val="center"/>
+          <w:tab w:pos="9354" w:val="right"/>
+        </w:tabs>
+        <w:spacing w:line="360" w:lineRule="auto" w:before="0" w:after="0"/>
+        <w:ind w:firstLine="0" w:left="0" w:right="0"/>
+        <w:jc w:val="both"/>
+      </w:pPr>
+      <w:r>
+        <w:rPr>
+          <w:rFonts w:ascii="Times New Roman" w:hAnsi="Times New Roman" w:eastAsia="Times New Roman" w:cs="Times New Roman"/>
+          <w:b w:val="0"/>
+          <w:i w:val="0"/>
+          <w:color w:val="000000"/>
+          <w:sz w:val="28"/>
+          <w:u w:val="none"/>
+        </w:rPr>
+        <w:tab/>
+      </w:r>
+      <m:oMath>
+        <m:sSub>
+          <m:e>
+            <m:r>
+              <w:rPr>
+                <w:sz w:val="28"/>
+              </w:rPr>
+              <m:t xml:space="preserve">V</m:t>
+            </m:r>
+          </m:e>
+          <m:sub>
+            <m:r>
+              <w:rPr>
+                <w:sz w:val="28"/>
+              </w:rPr>
+              <m:t xml:space="preserve">диск</m:t>
+            </m:r>
+          </m:sub>
+        </m:sSub>
+        <m:r>
+          <w:rPr>
+            <w:sz w:val="28"/>
+          </w:rPr>
+          <m:t xml:space="preserve"> = 5 · (0,04 + 29,5) + 10 ≈ 158 ГБ</m:t>
+        </m:r>
+      </m:oMath>
+      <w:r>
+        <w:rPr>
+          <w:rFonts w:ascii="Times New Roman" w:hAnsi="Times New Roman" w:eastAsia="Times New Roman" w:cs="Times New Roman"/>
+          <w:color w:val="000000"/>
+          <w:sz w:val="28"/>
+        </w:rPr>
+        <w:tab/>
+        <w:t>(9)</w:t>
+      </w:r>
+    </w:p>
+    <w:p>
+      <w:pPr>
+        <w:keepNext w:val="0"/>
+        <w:pageBreakBefore w:val="0"/>
+        <w:widowControl/>
+        <w:spacing w:line="360" w:lineRule="auto" w:before="0" w:after="0"/>
+        <w:ind w:firstLine="709" w:left="0" w:right="0"/>
+        <w:jc w:val="both"/>
+      </w:pPr>
+      <w:r>
+        <w:rPr>
+          <w:rFonts w:ascii="Times New Roman" w:hAnsi="Times New Roman" w:eastAsia="Times New Roman" w:cs="Times New Roman"/>
+          <w:b w:val="0"/>
+          <w:i w:val="0"/>
+          <w:color w:val="000000"/>
+          <w:sz w:val="28"/>
+          <w:u w:val="none"/>
+        </w:rPr>
+        <w:t>Принимается диск объёмом 160 ГБ: 2 ядра, 8 ГБ оперативной памяти, 160 ГБ диска.</w:t>
       </w:r>
     </w:p>
     <w:p>
       <w:pPr>
         <w:sectPr>
-          <w:pgSz w:w="16838" w:h="11906" w:orient="landscape"/>
+          <w:footerReference w:type="default" r:id="rId9"/>
+          <w:pgSz w:w="11906" w:h="16838"/>
           <w:pgMar w:top="1134" w:right="850" w:bottom="1134" w:left="1701" w:header="720" w:footer="567" w:gutter="0"/>
           <w:cols w:space="720"/>
+          <w:titlePg/>
           <w:docGrid w:linePitch="360"/>
         </w:sectPr>
       </w:pPr>
@@ -2484,7 +3286,7 @@
           <w:sz w:val="28"/>
           <w:u w:val="none"/>
         </w:rPr>
-        <w:t>Разработать систему из веб-сервиса, веб-приложения и нативного приложения, которая собирает в одном каталоге удельные княжества Древней Руси с археологическими данными об укреплениях: фотографией и видео, описанием раскопок, датой основания и коэффициентом земли. Эти данные служат исходными для оценки населения княжеств по площади укреплённых поселений.</w:t>
+        <w:t>Разработать веб-сервис и веб-приложение для каталога удельных княжеств Древней Руси с археологическими данными об укреплениях, по которым оценивается население княжеств.</w:t>
       </w:r>
     </w:p>
     <w:p>
@@ -2537,7 +3339,7 @@
           <w:sz w:val="28"/>
           <w:u w:val="none"/>
         </w:rPr>
-        <w:t>Система предназначена для накопления и просмотра археологических данных об удельных княжествах. В ней работают две группы пользователей. Гость просматривает плитку опубликованных княжеств с фильтром по дате основания и ленту, в которой княжества показываются по одному с видео укреплений, а также может зарегистрироваться и войти. Создатель — авторизованный археолог — дополнительно добавляет княжество с изображением и видео, дописывает в черновике описание раскопок, дату основания и коэффициент земли, публикует черновик, ставит и снимает лайки и удаляет свои княжества.</w:t>
+        <w:t>Система предназначена для накопления и просмотра археологических данных об удельных княжествах. В ней работают две группы пользователей. Гость просматривает плитку опубликованных княжеств с фильтром по дате основания и ленту, в которой княжества показываются по одному с видео укреплений, а также может зарегистрироваться и войти. Создатель (авторизованный археолог) дополнительно добавляет княжество с изображением и видео, дописывает в черновике описание раскопок, дату основания и коэффициент земли, публикует черновик, ставит и снимает лайки и удаляет свои княжества.</w:t>
       </w:r>
     </w:p>
     <w:p>
@@ -2601,7 +3403,7 @@
           <w:sz w:val="28"/>
           <w:u w:val="none"/>
         </w:rPr>
-        <w:t>Дизайн интерфейса в Figma и страницы ленты, плитки и добавления княжества на шаблонах (ЛР1) — Figma, Go, gin, html/template, CSS</w:t>
+        <w:t>Дизайн интерфейса в Figma и страницы ленты, плитки и добавления княжества на шаблонах – Figma, Go, gin, html/template, CSS</w:t>
       </w:r>
     </w:p>
     <w:p>
@@ -2633,7 +3435,7 @@
           <w:sz w:val="28"/>
           <w:u w:val="none"/>
         </w:rPr>
-        <w:t>База данных княжеств, археологов и лайков с логическим удалением, хранение изображений и видео в объектном хранилище (ЛР2) — PostgreSQL 16, GORM, Adminer, Minio, Docker Compose</w:t>
+        <w:t>База данных княжеств, археологов и лайков с логическим удалением, хранение изображений и видео в объектном хранилище – PostgreSQL 16, GORM, Adminer, Minio, Docker Compose</w:t>
       </w:r>
     </w:p>
     <w:p>
@@ -2665,7 +3467,7 @@
           <w:sz w:val="28"/>
           <w:u w:val="none"/>
         </w:rPr>
-        <w:t>Веб-сервис с доменами княжеств и археологов (ЛР3) — Go 1.26, gin, GORM, minio-go/v7, Postman</w:t>
+        <w:t>Веб-сервис с доменами княжеств и археологов – Go 1.26, gin, GORM, minio-go/v7, Postman</w:t>
       </w:r>
     </w:p>
     <w:p>
@@ -2697,7 +3499,7 @@
           <w:sz w:val="28"/>
           <w:u w:val="none"/>
         </w:rPr>
-        <w:t>Аутентификация и авторизация археологов, описание API (ЛР4) — JWT (golang-jwt/jwt), Redis 6.2 для blacklist токенов, go-redis, swaggo/swag, Swagger UI</w:t>
+        <w:t>Аутентификация и авторизация археологов, описание API – JWT (golang-jwt/jwt), Redis 6.2 для blacklist токенов, go-redis, swaggo/swag, Swagger UI</w:t>
       </w:r>
     </w:p>
     <w:p>
@@ -2729,7 +3531,7 @@
           <w:sz w:val="28"/>
           <w:u w:val="none"/>
         </w:rPr>
-        <w:t>Базовое SPA гостя: лента и плитка княжеств с фильтром по дате основания на mock-данных (ЛР5) — React 18, TypeScript, Vite, React-Bootstrap</w:t>
+        <w:t>Базовое SPA гостя: лента и плитка княжеств с фильтром по дате основания на mock-данных – React 19, TypeScript, Vite, React-Bootstrap</w:t>
       </w:r>
     </w:p>
     <w:p>
@@ -2761,7 +3563,7 @@
           <w:sz w:val="28"/>
           <w:u w:val="none"/>
         </w:rPr>
-        <w:t>Интерфейс создателя: вход, добавление княжества, лайки и удаление, подключение к веб-сервису (ЛР6) — Redux Toolkit, redux-thunk, axios, кодогенерация из Swagger, прокси Vite</w:t>
+        <w:t>Интерфейс создателя: вход, добавление княжества, лайки и удаление, подключение к веб-сервису – Redux Toolkit, redux-thunk, axios, кодогенерация из Swagger, прокси Vite</w:t>
       </w:r>
     </w:p>
     <w:p>
@@ -2793,7 +3595,7 @@
           <w:sz w:val="28"/>
           <w:u w:val="none"/>
         </w:rPr>
-        <w:t>Хранение фильтра в менеджере состояний, адаптивность, PWA и нативное приложение гостя (ЛР7) — Redux Toolkit, React-Bootstrap, PWA, Tauri</w:t>
+        <w:t>Хранение фильтра в менеджере состояний, адаптивность и PWA – Redux Toolkit, React-Bootstrap, PWA</w:t>
       </w:r>
     </w:p>
     <w:p>
@@ -2825,7 +3627,7 @@
           <w:sz w:val="28"/>
           <w:u w:val="none"/>
         </w:rPr>
-        <w:t>Демонстрация фронтенда в GitHub Pages — GitHub Pages, HTTPS</w:t>
+        <w:t>Демонстрация фронтенда в GitHub Pages – GitHub Pages, HTTPS</w:t>
       </w:r>
     </w:p>
     <w:p>
@@ -2857,7 +3659,7 @@
           <w:sz w:val="28"/>
           <w:u w:val="none"/>
         </w:rPr>
-        <w:t>Документация: ТЗ, РПЗ, диаграммы ER, классов, последовательности, прецедентов и развертывания — StarUML, Swagger, оформление по ГОСТ 7.32</w:t>
+        <w:t>Документация: ТЗ, РПЗ, диаграммы ER, классов, последовательности, прецедентов и развертывания – StarUML, Swagger, оформление по ГОСТ 7.32</w:t>
       </w:r>
     </w:p>
     <w:p>
@@ -2889,7 +3691,7 @@
           <w:sz w:val="28"/>
           <w:u w:val="none"/>
         </w:rPr>
-        <w:t>Репозитории Git principality-backend и principality-frontend с ветками по теме — Git, GitHub</w:t>
+        <w:t>Репозитории Git principality-backend и principality-frontend с ветками по теме – Git, GitHub</w:t>
       </w:r>
     </w:p>
     <w:p>
@@ -2910,7 +3712,50 @@
           <w:sz w:val="28"/>
           <w:u w:val="none"/>
         </w:rPr>
-        <w:t>Сверх перечисленных задач планируются дополнительные задания ДЗ: индексы в базе данных и лента в Redis (PostgreSQL, Redis, пагинация в React), нативное приложение гостя с поиском по изображению (Tauri, transformer.js, CLIP), межсервисное взаимодействие с асинхронным сервисом (NestJS, HTTP).</w:t>
+        <w:t xml:space="preserve">3.11. </w:t>
+      </w:r>
+      <w:r>
+        <w:rPr>
+          <w:rFonts w:ascii="Times New Roman" w:hAnsi="Times New Roman" w:eastAsia="Times New Roman" w:cs="Times New Roman"/>
+          <w:b w:val="0"/>
+          <w:i w:val="0"/>
+          <w:color w:val="000000"/>
+          <w:sz w:val="28"/>
+          <w:u w:val="none"/>
+        </w:rPr>
+        <w:t>Индексы в базе данных: более 100 000 княжеств, пагинация в React и ограничение количества в методе бэкенда, формирование ленты из 100 карточек в Redis – PostgreSQL 16, Redis 6.2, React</w:t>
+      </w:r>
+    </w:p>
+    <w:p>
+      <w:pPr>
+        <w:keepNext w:val="0"/>
+        <w:pageBreakBefore w:val="0"/>
+        <w:widowControl/>
+        <w:spacing w:line="360" w:lineRule="auto" w:before="0" w:after="0"/>
+        <w:ind w:firstLine="709" w:left="0" w:right="0"/>
+        <w:jc w:val="both"/>
+      </w:pPr>
+      <w:r>
+        <w:rPr>
+          <w:rFonts w:ascii="Times New Roman" w:hAnsi="Times New Roman" w:eastAsia="Times New Roman" w:cs="Times New Roman"/>
+          <w:b w:val="0"/>
+          <w:i w:val="0"/>
+          <w:color w:val="000000"/>
+          <w:sz w:val="28"/>
+          <w:u w:val="none"/>
+        </w:rPr>
+        <w:t xml:space="preserve">3.12. </w:t>
+      </w:r>
+      <w:r>
+        <w:rPr>
+          <w:rFonts w:ascii="Times New Roman" w:hAnsi="Times New Roman" w:eastAsia="Times New Roman" w:cs="Times New Roman"/>
+          <w:b w:val="0"/>
+          <w:i w:val="0"/>
+          <w:color w:val="000000"/>
+          <w:sz w:val="28"/>
+          <w:u w:val="none"/>
+        </w:rPr>
+        <w:t>Межсервисное взаимодействие: асинхронный сервис с одним HTTP-методом, который с задержкой 5–10 секунд обновляет положение 3D-модели княжества, просмотр модели в ленте через Three.js и Short Polling – NestJS, HTTP, Three.js</w:t>
       </w:r>
     </w:p>
     <w:p>
@@ -2957,7 +3802,7 @@
       <w:r>
         <w:rPr>
           <w:rFonts w:ascii="Times New Roman" w:hAnsi="Times New Roman" w:eastAsia="Times New Roman" w:cs="Times New Roman"/>
-          <w:b/>
+          <w:b w:val="0"/>
           <w:i w:val="0"/>
           <w:color w:val="000000"/>
           <w:sz w:val="28"/>
@@ -2968,7 +3813,7 @@
       <w:r>
         <w:rPr>
           <w:rFonts w:ascii="Times New Roman" w:hAnsi="Times New Roman" w:eastAsia="Times New Roman" w:cs="Times New Roman"/>
-          <w:b/>
+          <w:b w:val="0"/>
           <w:i w:val="0"/>
           <w:color w:val="000000"/>
           <w:sz w:val="28"/>
@@ -3006,7 +3851,7 @@
           <w:sz w:val="28"/>
           <w:u w:val="none"/>
         </w:rPr>
-        <w:t>GET /api/principalities?foundedBefore= — список опубликованных княжеств с фильтром по дате основания; доступно всем</w:t>
+        <w:t>GET /api/principalities?foundedBefore= – список опубликованных княжеств с фильтром по дате основания; доступно всем</w:t>
       </w:r>
     </w:p>
     <w:p>
@@ -3038,7 +3883,7 @@
           <w:sz w:val="28"/>
           <w:u w:val="none"/>
         </w:rPr>
-        <w:t>GET /api/principalities/feed, /api/principalities/feed/{principalityId}?next=true — лента: первое опубликованное княжество, княжество по идентификатору или следующее за ним; доступно всем</w:t>
+        <w:t>GET /api/principalities/feed, /api/principalities/feed/{principalityId}?next=true – лента: первое опубликованное княжество, княжество по идентификатору или следующее за ним; доступно всем</w:t>
       </w:r>
     </w:p>
     <w:p>
@@ -3070,7 +3915,7 @@
           <w:sz w:val="28"/>
           <w:u w:val="none"/>
         </w:rPr>
-        <w:t>GET /api/principalities/draft — черновик княжества текущего археолога; доступно только авторизованным археологам</w:t>
+        <w:t>GET /api/principalities/draft – черновик княжества текущего археолога; доступно только авторизованным археологам</w:t>
       </w:r>
     </w:p>
     <w:p>
@@ -3102,7 +3947,7 @@
           <w:sz w:val="28"/>
           <w:u w:val="none"/>
         </w:rPr>
-        <w:t>POST /api/principalities — создание черновика княжества с изображением и видео; доступно только авторизованным археологам</w:t>
+        <w:t>POST /api/principalities – создание черновика княжества с изображением и видео; доступно только авторизованным археологам</w:t>
       </w:r>
     </w:p>
     <w:p>
@@ -3134,7 +3979,7 @@
           <w:sz w:val="28"/>
           <w:u w:val="none"/>
         </w:rPr>
-        <w:t>PUT /api/principalities/draft/publish — публикация черновика текущего археолога; доступно только авторизованным археологам</w:t>
+        <w:t>PUT /api/principalities/draft/publish – публикация черновика текущего археолога; доступно только авторизованным археологам</w:t>
       </w:r>
     </w:p>
     <w:p>
@@ -3166,7 +4011,7 @@
           <w:sz w:val="28"/>
           <w:u w:val="none"/>
         </w:rPr>
-        <w:t>DELETE /api/principalities/{principalityId} — логическое удаление своего княжества; доступно только авторизованному археологу — создателю княжества</w:t>
+        <w:t>DELETE /api/principalities/{principalityId} – логическое удаление своего княжества; доступно только авторизованному археологу, создателю княжества</w:t>
       </w:r>
     </w:p>
     <w:p>
@@ -3198,7 +4043,7 @@
           <w:sz w:val="28"/>
           <w:u w:val="none"/>
         </w:rPr>
-        <w:t>POST /api/principalities/{principalityId}/like — постановка и снятие лайка княжеству; доступно только авторизованным археологам</w:t>
+        <w:t>POST /api/principalities/{principalityId}/like – постановка и снятие лайка княжеству; доступно только авторизованным археологам</w:t>
       </w:r>
     </w:p>
     <w:p>
@@ -3230,7 +4075,7 @@
           <w:sz w:val="28"/>
           <w:u w:val="none"/>
         </w:rPr>
-        <w:t>POST /api/archaeologists — регистрация археолога; доступно всем</w:t>
+        <w:t>POST /api/archaeologists – регистрация археолога; доступно всем</w:t>
       </w:r>
     </w:p>
     <w:p>
@@ -3262,7 +4107,7 @@
           <w:sz w:val="28"/>
           <w:u w:val="none"/>
         </w:rPr>
-        <w:t>POST /api/archaeologists/login — аутентификация археолога, выдача JWT; доступно всем</w:t>
+        <w:t>POST /api/archaeologists/login – аутентификация археолога, выдача JWT; доступно всем</w:t>
       </w:r>
     </w:p>
     <w:p>
@@ -3294,7 +4139,7 @@
           <w:sz w:val="28"/>
           <w:u w:val="none"/>
         </w:rPr>
-        <w:t>POST /api/archaeologists/logout — деавторизация археолога, JWT заносится в blacklist Redis; доступно только авторизованным археологам</w:t>
+        <w:t>POST /api/archaeologists/logout – деавторизация археолога, JWT заносится в blacklist Redis; доступно только авторизованным археологам</w:t>
       </w:r>
     </w:p>
     <w:p>
@@ -3309,7 +4154,7 @@
       <w:r>
         <w:rPr>
           <w:rFonts w:ascii="Times New Roman" w:hAnsi="Times New Roman" w:eastAsia="Times New Roman" w:cs="Times New Roman"/>
-          <w:b/>
+          <w:b w:val="0"/>
           <w:i w:val="0"/>
           <w:color w:val="000000"/>
           <w:sz w:val="28"/>
@@ -3320,7 +4165,7 @@
       <w:r>
         <w:rPr>
           <w:rFonts w:ascii="Times New Roman" w:hAnsi="Times New Roman" w:eastAsia="Times New Roman" w:cs="Times New Roman"/>
-          <w:b/>
+          <w:b w:val="0"/>
           <w:i w:val="0"/>
           <w:color w:val="000000"/>
           <w:sz w:val="28"/>
@@ -3486,7 +4331,7 @@
           <w:sz w:val="28"/>
           <w:u w:val="none"/>
         </w:rPr>
-        <w:t>Лента — переход на страницу 4.5</w:t>
+        <w:t>Лента – переход на страницу 4.5</w:t>
       </w:r>
     </w:p>
     <w:p>
@@ -3518,7 +4363,7 @@
           <w:sz w:val="28"/>
           <w:u w:val="none"/>
         </w:rPr>
-        <w:t>Плитка — переход на страницу 4.4</w:t>
+        <w:t>Плитка – переход на страницу 4.4</w:t>
       </w:r>
     </w:p>
     <w:p>
@@ -3550,7 +4395,7 @@
           <w:sz w:val="28"/>
           <w:u w:val="none"/>
         </w:rPr>
-        <w:t>Добавление — переход на страницу 4.6, только создателю</w:t>
+        <w:t>Добавление – переход на страницу 4.6, только создателю</w:t>
       </w:r>
     </w:p>
     <w:p>
@@ -3582,7 +4427,7 @@
           <w:sz w:val="28"/>
           <w:u w:val="none"/>
         </w:rPr>
-        <w:t>Вход — переход на страницу 4.3, только гостю</w:t>
+        <w:t>Вход – переход на страницу 4.3, только гостю</w:t>
       </w:r>
     </w:p>
     <w:p>
@@ -3614,7 +4459,7 @@
           <w:sz w:val="28"/>
           <w:u w:val="none"/>
         </w:rPr>
-        <w:t>Выход — деавторизация (вызывается метод 4.1.10), сброс фильтра и переключение на интерфейс гостя, только создателю</w:t>
+        <w:t>Выход – деавторизация (вызывается метод 4.1.10), сброс фильтра и переключение на интерфейс гостя, только создателю</w:t>
       </w:r>
     </w:p>
     <w:p>
@@ -3629,7 +4474,7 @@
       <w:r>
         <w:rPr>
           <w:rFonts w:ascii="Times New Roman" w:hAnsi="Times New Roman" w:eastAsia="Times New Roman" w:cs="Times New Roman"/>
-          <w:b/>
+          <w:b w:val="0"/>
           <w:i w:val="0"/>
           <w:color w:val="000000"/>
           <w:sz w:val="28"/>
@@ -3640,7 +4485,7 @@
       <w:r>
         <w:rPr>
           <w:rFonts w:ascii="Times New Roman" w:hAnsi="Times New Roman" w:eastAsia="Times New Roman" w:cs="Times New Roman"/>
-          <w:b/>
+          <w:b w:val="0"/>
           <w:i w:val="0"/>
           <w:color w:val="000000"/>
           <w:sz w:val="28"/>
@@ -3838,7 +4683,7 @@
           <w:sz w:val="28"/>
           <w:u w:val="none"/>
         </w:rPr>
-        <w:t>Войти — вызывается метод 4.1.9, полученный токен сохраняется, интерфейс переключается на интерфейс создателя</w:t>
+        <w:t>Войти – вызывается метод 4.1.9, полученный токен сохраняется, интерфейс переключается на интерфейс создателя</w:t>
       </w:r>
     </w:p>
     <w:p>
@@ -3870,7 +4715,7 @@
           <w:sz w:val="28"/>
           <w:u w:val="none"/>
         </w:rPr>
-        <w:t>Зарегистрироваться — вызывается метод 4.1.8, затем вход по введённым логину и паролю</w:t>
+        <w:t>Зарегистрироваться – вызывается метод 4.1.8, затем вход по введённым логину и паролю</w:t>
       </w:r>
     </w:p>
     <w:p>
@@ -3885,7 +4730,7 @@
       <w:r>
         <w:rPr>
           <w:rFonts w:ascii="Times New Roman" w:hAnsi="Times New Roman" w:eastAsia="Times New Roman" w:cs="Times New Roman"/>
-          <w:b/>
+          <w:b w:val="0"/>
           <w:i w:val="0"/>
           <w:color w:val="000000"/>
           <w:sz w:val="28"/>
@@ -3896,7 +4741,7 @@
       <w:r>
         <w:rPr>
           <w:rFonts w:ascii="Times New Roman" w:hAnsi="Times New Roman" w:eastAsia="Times New Roman" w:cs="Times New Roman"/>
-          <w:b/>
+          <w:b w:val="0"/>
           <w:i w:val="0"/>
           <w:color w:val="000000"/>
           <w:sz w:val="28"/>
@@ -3998,7 +4843,7 @@
           <w:sz w:val="28"/>
           <w:u w:val="none"/>
         </w:rPr>
-        <w:t>Изображение укреплений, при отсутствии — изображение по умолчанию</w:t>
+        <w:t>Изображение укреплений, при отсутствии – изображение по умолчанию</w:t>
       </w:r>
     </w:p>
     <w:p>
@@ -4190,7 +5035,7 @@
           <w:sz w:val="28"/>
           <w:u w:val="none"/>
         </w:rPr>
-        <w:t>Фильтр по дате основания — дата выбирается в календаре, по кнопке вызывается метод 4.1.1 с параметром foundedBefore, доступно всем</w:t>
+        <w:t>Фильтр по дате основания – дата выбирается в календаре, по кнопке вызывается метод 4.1.1 с параметром foundedBefore, доступно всем</w:t>
       </w:r>
     </w:p>
     <w:p>
@@ -4222,7 +5067,7 @@
           <w:sz w:val="28"/>
           <w:u w:val="none"/>
         </w:rPr>
-        <w:t>Открыть карточку — переход на страницу 4.5 к выбранному княжеству (вызывается метод 4.1.2), доступно всем</w:t>
+        <w:t>Открыть карточку – переход на страницу 4.5 к выбранному княжеству (вызывается метод 4.1.2), доступно всем</w:t>
       </w:r>
     </w:p>
     <w:p>
@@ -4254,7 +5099,7 @@
           <w:sz w:val="28"/>
           <w:u w:val="none"/>
         </w:rPr>
-        <w:t>Лайк — ставит или снимает лайк (вызывается метод 4.1.7), только создателю</w:t>
+        <w:t>Лайк – ставит или снимает лайк (вызывается метод 4.1.7), только создателю</w:t>
       </w:r>
     </w:p>
     <w:p>
@@ -4286,7 +5131,7 @@
           <w:sz w:val="28"/>
           <w:u w:val="none"/>
         </w:rPr>
-        <w:t>Удалить — удаляет своё княжество (вызывается метод 4.1.6), кнопка видна только на карточках с признаком created_by_current_archaeologist = 1</w:t>
+        <w:t>Удалить – удаляет своё княжество (вызывается метод 4.1.6), кнопка видна только на карточках с признаком created_by_current_archaeologist = 1</w:t>
       </w:r>
     </w:p>
     <w:p>
@@ -4301,7 +5146,7 @@
       <w:r>
         <w:rPr>
           <w:rFonts w:ascii="Times New Roman" w:hAnsi="Times New Roman" w:eastAsia="Times New Roman" w:cs="Times New Roman"/>
-          <w:b/>
+          <w:b w:val="0"/>
           <w:i w:val="0"/>
           <w:color w:val="000000"/>
           <w:sz w:val="28"/>
@@ -4312,7 +5157,7 @@
       <w:r>
         <w:rPr>
           <w:rFonts w:ascii="Times New Roman" w:hAnsi="Times New Roman" w:eastAsia="Times New Roman" w:cs="Times New Roman"/>
-          <w:b/>
+          <w:b w:val="0"/>
           <w:i w:val="0"/>
           <w:color w:val="000000"/>
           <w:sz w:val="28"/>
@@ -4414,7 +5259,7 @@
           <w:sz w:val="28"/>
           <w:u w:val="none"/>
         </w:rPr>
-        <w:t>Видео укреплений с автоматическим воспроизведением, при отсутствии — видео по умолчанию</w:t>
+        <w:t>Видео укреплений с автоматическим воспроизведением, при отсутствии – видео по умолчанию</w:t>
       </w:r>
     </w:p>
     <w:p>
@@ -4574,7 +5419,7 @@
           <w:sz w:val="28"/>
           <w:u w:val="none"/>
         </w:rPr>
-        <w:t>Далее — переход к следующему княжеству (вызывается метод 4.1.2 с параметром next=true), после последнего лента начинается с первого, доступно всем</w:t>
+        <w:t>Далее – переход к следующему княжеству (вызывается метод 4.1.2 с параметром next=true), после последнего лента начинается с первого, доступно всем</w:t>
       </w:r>
     </w:p>
     <w:p>
@@ -4606,7 +5451,7 @@
           <w:sz w:val="28"/>
           <w:u w:val="none"/>
         </w:rPr>
-        <w:t>Лайк — ставит или снимает лайк (вызывается метод 4.1.7), только создателю</w:t>
+        <w:t>Лайк – ставит или снимает лайк (вызывается метод 4.1.7), только создателю</w:t>
       </w:r>
     </w:p>
     <w:p>
@@ -4621,7 +5466,7 @@
       <w:r>
         <w:rPr>
           <w:rFonts w:ascii="Times New Roman" w:hAnsi="Times New Roman" w:eastAsia="Times New Roman" w:cs="Times New Roman"/>
-          <w:b/>
+          <w:b w:val="0"/>
           <w:i w:val="0"/>
           <w:color w:val="000000"/>
           <w:sz w:val="28"/>
@@ -4632,7 +5477,7 @@
       <w:r>
         <w:rPr>
           <w:rFonts w:ascii="Times New Roman" w:hAnsi="Times New Roman" w:eastAsia="Times New Roman" w:cs="Times New Roman"/>
-          <w:b/>
+          <w:b w:val="0"/>
           <w:i w:val="0"/>
           <w:color w:val="000000"/>
           <w:sz w:val="28"/>
@@ -4798,7 +5643,7 @@
           <w:sz w:val="28"/>
           <w:u w:val="none"/>
         </w:rPr>
-        <w:t>Для черновика — поле описания раскопок</w:t>
+        <w:t>Для черновика – поле описания раскопок</w:t>
       </w:r>
     </w:p>
     <w:p>
@@ -4830,7 +5675,7 @@
           <w:sz w:val="28"/>
           <w:u w:val="none"/>
         </w:rPr>
-        <w:t>Для черновика — поле даты основания</w:t>
+        <w:t>Для черновика – поле даты основания</w:t>
       </w:r>
     </w:p>
     <w:p>
@@ -4862,7 +5707,7 @@
           <w:sz w:val="28"/>
           <w:u w:val="none"/>
         </w:rPr>
-        <w:t>Для черновика — поле коэффициента земли (от 0 до 1)</w:t>
+        <w:t>Для черновика – поле коэффициента земли (от 0 до 1)</w:t>
       </w:r>
     </w:p>
     <w:p>
@@ -4926,7 +5771,7 @@
           <w:sz w:val="28"/>
           <w:u w:val="none"/>
         </w:rPr>
-        <w:t>Далее — создаёт черновик с названием, изображением и видео (вызывается метод 4.1.4)</w:t>
+        <w:t>Далее – создаёт черновик с названием, изображением и видео (вызывается метод 4.1.4)</w:t>
       </w:r>
     </w:p>
     <w:p>
@@ -4958,7 +5803,7 @@
           <w:sz w:val="28"/>
           <w:u w:val="none"/>
         </w:rPr>
-        <w:t>Опубликовать — публикует черновик с описанием, датой основания и коэффициентом (вызывается метод 4.1.5), княжество появляется в плитке и ленте</w:t>
+        <w:t>Опубликовать – публикует черновик с описанием, датой основания и коэффициентом (вызывается метод 4.1.5), княжество появляется в плитке и ленте</w:t>
       </w:r>
     </w:p>
     <w:p>
@@ -5005,7 +5850,7 @@
       <w:r>
         <w:rPr>
           <w:rFonts w:ascii="Times New Roman" w:hAnsi="Times New Roman" w:eastAsia="Times New Roman" w:cs="Times New Roman"/>
-          <w:b/>
+          <w:b w:val="0"/>
           <w:i w:val="0"/>
           <w:color w:val="000000"/>
           <w:sz w:val="28"/>
@@ -5016,7 +5861,7 @@
       <w:r>
         <w:rPr>
           <w:rFonts w:ascii="Times New Roman" w:hAnsi="Times New Roman" w:eastAsia="Times New Roman" w:cs="Times New Roman"/>
-          <w:b/>
+          <w:b w:val="0"/>
           <w:i w:val="0"/>
           <w:color w:val="000000"/>
           <w:sz w:val="28"/>
@@ -5086,7 +5931,7 @@
           <w:sz w:val="28"/>
           <w:u w:val="none"/>
         </w:rPr>
-        <w:t>Оперативная память не менее 4 ГБ</w:t>
+        <w:t>Оперативная память не менее 8 ГБ</w:t>
       </w:r>
     </w:p>
     <w:p>
@@ -5118,7 +5963,7 @@
           <w:sz w:val="28"/>
           <w:u w:val="none"/>
         </w:rPr>
-        <w:t>Свободное место на диске не менее 20 ГБ</w:t>
+        <w:t>Свободное место на диске не менее 160 ГБ (база данных и объектное хранилище за 5 лет с запасом)</w:t>
       </w:r>
     </w:p>
     <w:p>
@@ -5133,7 +5978,7 @@
       <w:r>
         <w:rPr>
           <w:rFonts w:ascii="Times New Roman" w:hAnsi="Times New Roman" w:eastAsia="Times New Roman" w:cs="Times New Roman"/>
-          <w:b/>
+          <w:b w:val="0"/>
           <w:i w:val="0"/>
           <w:color w:val="000000"/>
           <w:sz w:val="28"/>
@@ -5144,7 +5989,7 @@
       <w:r>
         <w:rPr>
           <w:rFonts w:ascii="Times New Roman" w:hAnsi="Times New Roman" w:eastAsia="Times New Roman" w:cs="Times New Roman"/>
-          <w:b/>
+          <w:b w:val="0"/>
           <w:i w:val="0"/>
           <w:color w:val="000000"/>
           <w:sz w:val="28"/>
@@ -5293,7 +6138,7 @@
       <w:r>
         <w:rPr>
           <w:rFonts w:ascii="Times New Roman" w:hAnsi="Times New Roman" w:eastAsia="Times New Roman" w:cs="Times New Roman"/>
-          <w:b/>
+          <w:b w:val="0"/>
           <w:i w:val="0"/>
           <w:color w:val="000000"/>
           <w:sz w:val="28"/>
@@ -5304,7 +6149,7 @@
       <w:r>
         <w:rPr>
           <w:rFonts w:ascii="Times New Roman" w:hAnsi="Times New Roman" w:eastAsia="Times New Roman" w:cs="Times New Roman"/>
-          <w:b/>
+          <w:b w:val="0"/>
           <w:i w:val="0"/>
           <w:color w:val="000000"/>
           <w:sz w:val="28"/>
@@ -5613,7 +6458,7 @@
       <w:r>
         <w:rPr>
           <w:rFonts w:ascii="Times New Roman" w:hAnsi="Times New Roman" w:eastAsia="Times New Roman" w:cs="Times New Roman"/>
-          <w:b/>
+          <w:b w:val="0"/>
           <w:i w:val="0"/>
           <w:color w:val="000000"/>
           <w:sz w:val="28"/>
@@ -5624,7 +6469,7 @@
       <w:r>
         <w:rPr>
           <w:rFonts w:ascii="Times New Roman" w:hAnsi="Times New Roman" w:eastAsia="Times New Roman" w:cs="Times New Roman"/>
-          <w:b/>
+          <w:b w:val="0"/>
           <w:i w:val="0"/>
           <w:color w:val="000000"/>
           <w:sz w:val="28"/>
@@ -5694,7 +6539,39 @@
           <w:sz w:val="28"/>
           <w:u w:val="none"/>
         </w:rPr>
-        <w:t>Фронтенд (планируемые версии): React 18.3.1, TypeScript 7.0.2, Vite 8.3.4, React-Bootstrap 2.10.10, Redux Toolkit 2.13.0, axios 1.20.0; сборка в Node.js 24.3.0</w:t>
+        <w:t>Фронтенд: React 19.3.1, TypeScript 7.0.2, Vite 8.3.5, React-Bootstrap 2.10.10, react-router-dom 7.18.4; сборка в Node.js 24.3.0</w:t>
+      </w:r>
+    </w:p>
+    <w:p>
+      <w:pPr>
+        <w:keepNext w:val="0"/>
+        <w:pageBreakBefore w:val="0"/>
+        <w:widowControl/>
+        <w:spacing w:line="360" w:lineRule="auto" w:before="0" w:after="0"/>
+        <w:ind w:firstLine="709" w:left="709" w:right="0"/>
+        <w:jc w:val="both"/>
+      </w:pPr>
+      <w:r>
+        <w:rPr>
+          <w:rFonts w:ascii="Times New Roman" w:hAnsi="Times New Roman" w:eastAsia="Times New Roman" w:cs="Times New Roman"/>
+          <w:b w:val="0"/>
+          <w:i w:val="0"/>
+          <w:color w:val="000000"/>
+          <w:sz w:val="28"/>
+          <w:u w:val="none"/>
+        </w:rPr>
+        <w:t xml:space="preserve">6.2.3. </w:t>
+      </w:r>
+      <w:r>
+        <w:rPr>
+          <w:rFonts w:ascii="Times New Roman" w:hAnsi="Times New Roman" w:eastAsia="Times New Roman" w:cs="Times New Roman"/>
+          <w:b w:val="0"/>
+          <w:i w:val="0"/>
+          <w:color w:val="000000"/>
+          <w:sz w:val="28"/>
+          <w:u w:val="none"/>
+        </w:rPr>
+        <w:t>Планируемые: Redux Toolkit 2.13.0, axios 1.20.0</w:t>
       </w:r>
     </w:p>
     <w:p>
@@ -5727,27 +6604,6 @@
           <w:sz w:val="28"/>
         </w:rPr>
         <w:t>ПРИЛОЖЕНИЕ 2 ТАБЛИЦА МЕТОДОВ ВЕБ-СЕРВИСА</w:t>
-      </w:r>
-    </w:p>
-    <w:p>
-      <w:pPr>
-        <w:keepNext w:val="0"/>
-        <w:pageBreakBefore w:val="0"/>
-        <w:widowControl/>
-        <w:spacing w:line="360" w:lineRule="auto" w:before="0" w:after="0"/>
-        <w:ind w:firstLine="709" w:left="0" w:right="0"/>
-        <w:jc w:val="both"/>
-      </w:pPr>
-      <w:r>
-        <w:rPr>
-          <w:rFonts w:ascii="Times New Roman" w:hAnsi="Times New Roman" w:eastAsia="Times New Roman" w:cs="Times New Roman"/>
-          <w:b w:val="0"/>
-          <w:i w:val="0"/>
-          <w:color w:val="000000"/>
-          <w:sz w:val="28"/>
-          <w:u w:val="none"/>
-        </w:rPr>
-        <w:t>Все методы веб-сервиса начинаются с /api и сгруппированы по доменам княжеств и археологов. Номер метода совпадает с пунктом 4.1 технического задания. Объект княжества в ответах содержит поля: principality_id: integer, principality_name: string, principality_summary: string, principality_status: string (draft, published), image_key: string, video_key: string, principality_image_url: string, principality_video_url: string, founding_date: string (RFC 3339), land_coefficient: number, created_at: string (RFC 3339), published_at: string (RFC 3339), created_by: integer. Ответ с ошибкой имеет вид status: string (error), description: string. Методы создателя без действующего токена отвечают кодом 403 с пустым телом, выход без токена — кодом 400.</w:t>
       </w:r>
     </w:p>
     <w:p>
@@ -6201,7 +7057,7 @@
                 <w:sz w:val="24"/>
                 <w:u w:val="none"/>
               </w:rPr>
-              <w:t>200: массив объектов княжества, у каждого дополнительно principality_like_count: integer, created_by_current_archaeologist: integer (0/1); 400, 500</w:t>
+              <w:t>200: массив объектов княжества: principality_id: integer, principality_name: string, principality_summary: string, principality_status: string (draft, published), image_key: string, video_key: string, principality_image_url: string, principality_video_url: string, founding_date: string (RFC 3339), land_coefficient: number, created_at: string (RFC 3339), published_at: string (RFC 3339), created_by: integer, principality_like_count: integer, created_by_current_archaeologist: integer (0/1); 400, 500</w:t>
             </w:r>
           </w:p>
         </w:tc>
@@ -6395,7 +7251,7 @@
                 <w:sz w:val="24"/>
                 <w:u w:val="none"/>
               </w:rPr>
-              <w:t>200: объект княжества, дополнительно principality_like_count: integer, principality_liked: integer (0/1); 400, 404, 500</w:t>
+              <w:t>200: объект княжества (поля как в 4.1.1), principality_like_count: integer, principality_liked: integer (0/1); 400, 404, 500</w:t>
             </w:r>
           </w:p>
         </w:tc>
@@ -6589,7 +7445,7 @@
                 <w:sz w:val="24"/>
                 <w:u w:val="none"/>
               </w:rPr>
-              <w:t>200: объект княжества-черновика; 403, 404, 500</w:t>
+              <w:t>200: черновик княжества (поля как в 4.1.1); 403, 404, 500</w:t>
             </w:r>
           </w:p>
         </w:tc>
@@ -6783,7 +7639,7 @@
                 <w:sz w:val="24"/>
                 <w:u w:val="none"/>
               </w:rPr>
-              <w:t>201: объект княжества-черновика, image_key и video_key сгенерированы сервером; 400, 403, 409, 500</w:t>
+              <w:t>201: черновик княжества (поля как в 4.1.1), image_key и video_key сгенерированы сервером; 400, 403, 409, 500</w:t>
             </w:r>
           </w:p>
         </w:tc>
@@ -6977,7 +7833,7 @@
                 <w:sz w:val="24"/>
                 <w:u w:val="none"/>
               </w:rPr>
-              <w:t>200: объект опубликованного княжества; 400, 403, 404, 409, 500</w:t>
+              <w:t>200: опубликованное княжество (поля как в 4.1.1); 400, 403, 404, 409, 500</w:t>
             </w:r>
           </w:p>
         </w:tc>
@@ -7117,7 +7973,7 @@
                 <w:sz w:val="24"/>
                 <w:u w:val="none"/>
               </w:rPr>
-              <w:t>Авторизованный археолог — создатель княжества (Authorization: Bearer)</w:t>
+              <w:t>Авторизованный археолог, создатель княжества (Authorization: Bearer)</w:t>
             </w:r>
           </w:p>
         </w:tc>
@@ -7338,7 +8194,7 @@
                 <w:sz w:val="24"/>
                 <w:u w:val="none"/>
               </w:rPr>
-              <w:t>Заголовок Authorization: Bearer &lt;access_token&gt;; path principalityId: integer; JSON: principality_liked: integer (1 — поставить, 0 — снять)</w:t>
+              <w:t>Заголовок Authorization: Bearer &lt;access_token&gt;; path principalityId: integer; JSON: principality_liked: integer (1 – поставить, 0 – снять)</w:t>
             </w:r>
           </w:p>
         </w:tc>

</xml_diff>